<commit_message>
fix sklearn mixin order; extend lambda sweep; document selection bias
</commit_message>
<xml_diff>
--- a/paper/Sparse-RADDT-report.docx
+++ b/paper/Sparse-RADDT-report.docx
@@ -59,7 +59,7 @@
           <w:i w:val="0"/>
           <w:sz w:val="21"/>
         </w:rPr>
-        <w:t>决策树以可解释性见长，但贪心构建策略只能保证局部最优。RADDT 通过“ReLU + Argmin”重构，把整棵树的训练转化为无约束可微优化，在保留硬分裂的同时实现全局优化。本文做两件事：其一，独立复现 RADDT，并在四个 UCI 数据集上与 CART、随机森林做五折交叉验证对比；其二，在分裂权重上引入 L1 稀疏正则（Sparse-RADDT），并系统考察树深与正则强度的影响。实验表明：修正树深设置后，RADDT 在四个数据集上均优于 CART，并在 Wine 与 BreastCancer 上追平随机森林；L1 正则的效果强烈依赖强度——λ=1e-3 时在 Digits 上同时提升准确率（+1.2 个百分点）与权重稀疏度（7.0%），而 λ=1e-2 会造成 6.2 个百分点的性能下降。本文进一步记录了复现过程中三个容易被忽视的实现陷阱，它们都会让实验结果在表面正常的情况下失去意义。</w:t>
+        <w:t>决策树以可解释性见长，但贪心构建策略只能保证局部最优。RADDT 通过“ReLU + Argmin”重构，把整棵树的训练转化为无约束可微优化，在保留硬分裂的同时实现全局优化。本文做两件事：其一，独立复现 RADDT，并在四个 UCI 数据集上与 CART、随机森林做五折交叉验证对比；其二，在分裂权重上引入 L1 稀疏正则（Sparse-RADDT），并系统考察树深与正则强度的影响。实验表明：修正树深设置后，RADDT 在四个数据集上均优于 CART，并在 Wine 与 BreastCancer 上追平随机森林；L1 正则的效果强烈依赖强度——λ=1e-3 时在 Digits 上同时提升准确率（+1.2 个百分点）与权重稀疏度（7.0%），而 λ=1e-2 会造成 6.2 个百分点的性能下降。本文进一步记录了复现过程中四个容易被忽视的实现陷阱，它们都会让实验结果在表面正常的情况下失去意义。</w:t>
       </w:r>
     </w:p>
     <w:p>
@@ -151,7 +151,7 @@
           <w:i w:val="0"/>
           <w:sz w:val="21"/>
         </w:rPr>
-        <w:t>（3）记录复现过程中三个实现陷阱——它们不会报错，却会让实验结论失效。我们认为第三点对后续复现者最有价值。</w:t>
+        <w:t>（3）记录复现过程中四个实现陷阱——它们不会报错，却会让实验结论失效。我们认为这一节对后续复现者最有价值。</w:t>
       </w:r>
     </w:p>
     <w:p>
@@ -1555,6 +1555,16 @@
       </w:r>
     </w:p>
     <w:p>
+      <w:r>
+        <w:rPr>
+          <w:b w:val="0"/>
+          <w:i w:val="0"/>
+          <w:sz w:val="21"/>
+        </w:rPr>
+        <w:t>需要说明的是，λ=1e-3 是在这同一组交叉验证折上选出来的，因此 +1.2 个百分点应视为探索性结果，而非无偏估计；严格做法是嵌套交叉验证或独立的验证集，本文没有做。</w:t>
+      </w:r>
+    </w:p>
+    <w:p>
       <w:pPr>
         <w:pStyle w:val="Heading2"/>
       </w:pPr>
@@ -2096,7 +2106,7 @@
         <w:rPr>
           <w:rFonts w:ascii="Times New Roman" w:hAnsi="Times New Roman" w:eastAsia="黑体"/>
         </w:rPr>
-        <w:t>6  复现中的三个陷阱</w:t>
+        <w:t>6  复现中的四个陷阱</w:t>
       </w:r>
     </w:p>
     <w:p>
@@ -2106,7 +2116,7 @@
           <w:i w:val="0"/>
           <w:sz w:val="21"/>
         </w:rPr>
-        <w:t>我们的第一版实现可以跑通、也能产出“看起来合理”的表格，但结论是错的。以下三点是根因，且都不会触发任何报错。</w:t>
+        <w:t>我们的第一版实现可以跑通、也能产出“看起来合理”的表格，但结论是错的。以下四点是根因，且都不会触发任何报错。</w:t>
       </w:r>
     </w:p>
     <w:p>
@@ -2137,6 +2147,16 @@
           <w:sz w:val="21"/>
         </w:rPr>
         <w:t>陷阱三：对照实验中混入第二个变量。修正树深的同时，正则强度也发生了改变，导致“提升来自树深”这一说法不成立。本文第 5.2 节的实验固定了 λ 与随机种子，只改变树深，才构成受控对照。</w:t>
+      </w:r>
+    </w:p>
+    <w:p>
+      <w:r>
+        <w:rPr>
+          <w:b w:val="0"/>
+          <w:i w:val="0"/>
+          <w:sz w:val="21"/>
+        </w:rPr>
+        <w:t>陷阱四：估计器没有被 scikit-learn 认成分类器。分类器的继承顺序写成 (RADDTBase, ClassifierMixin)，mixin 排在后面，is_classifier() 因此返回 False。cross_val_score 收到整数 cv 时会退回普通 KFold；Iris 按类别排序，每一折整折都是同一类，训练集里根本没有这个类别，准确率直接变成 0。显式传 StratifiedKFold 时一切正常，所以这个 bug 只有在换一种调用方式时才会暴露。修正方式是把 mixin 放到前面，并补一条使用整数 cv 的回归测试。</w:t>
       </w:r>
     </w:p>
     <w:p>

</xml_diff>

<commit_message>
consistency pass: four pitfalls, lambda figure, wording
</commit_message>
<xml_diff>
--- a/paper/Sparse-RADDT-report.docx
+++ b/paper/Sparse-RADDT-report.docx
@@ -59,7 +59,7 @@
           <w:i w:val="0"/>
           <w:sz w:val="21"/>
         </w:rPr>
-        <w:t>决策树以可解释性见长，但贪心构建策略只能保证局部最优。RADDT 通过“ReLU + Argmin”重构，把整棵树的训练转化为无约束可微优化，在保留硬分裂的同时实现全局优化。本文做两件事：其一，独立复现 RADDT，并在四个 UCI 数据集上与 CART、随机森林做五折交叉验证对比；其二，在分裂权重上引入 L1 稀疏正则（Sparse-RADDT），并系统考察树深与正则强度的影响。实验表明：修正树深设置后，RADDT 在四个数据集上均优于 CART，并在 Wine 与 BreastCancer 上追平随机森林；L1 正则的效果强烈依赖强度——λ=1e-3 时在 Digits 上同时提升准确率（+1.2 个百分点）与权重稀疏度（7.0%），而 λ=1e-2 会造成 6.2 个百分点的性能下降。本文进一步记录了复现过程中四个容易被忽视的实现陷阱，它们都会让实验结果在表面正常的情况下失去意义。</w:t>
+        <w:t>决策树以可解释性见长，但贪心构建策略只能保证局部最优。RADDT 通过“ReLU + Argmin”重构，把整棵树的训练转化为无约束的可微目标，并用梯度下降优化，同时保留硬分裂。需要说明的是，梯度优化并不保证找到全局最优，本文只声称它把树参数化成了可优化的连续目标。本文做两件事：其一，独立复现 RADDT，并在四个 UCI 数据集上与 CART、随机森林做五折交叉验证对比；其二，在分裂权重上引入 L1 稀疏正则（Sparse-RADDT），并系统考察树深与正则强度的影响。实验表明：修正树深设置后，RADDT 在四个数据集上均优于 CART，并在 Wine 与 BreastCancer 上追平随机森林；L1 正则的效果强烈依赖强度——λ=1e-3 时在 Digits 上同时提升准确率（+1.2 个百分点）与权重稀疏度（7.0%），而 λ=1e-2 会造成 6.2 个百分点的性能下降。本文进一步记录了复现过程中四个容易被忽视的实现陷阱，它们都会让实验结果在表面正常的情况下失去意义。</w:t>
       </w:r>
     </w:p>
     <w:p>
@@ -90,7 +90,7 @@
           <w:i w:val="0"/>
           <w:sz w:val="21"/>
         </w:rPr>
-        <w:t>Decision trees are valued for interpretability, but greedy induction is only locally optimal. RADDT reformulates tree training as an unconstrained differentiable optimization problem via a ReLU + Argmin construction, keeping hard splits while enabling global optimization. We (i) independently reproduce RADDT and compare it with CART and Random Forest on four UCI datasets under 5-fold cross-validation, and (ii) add an L1 penalty on split weights (Sparse-RADDT) and study the effect of tree depth and regularization strength. After correcting the tree-depth configuration, RADDT outperforms CART on all four datasets and matches Random Forest on Wine and BreastCancer. The L1 penalty is highly sensitive to its strength: at lambda=1e-3 it improves Digits accuracy by 1.2 points while sparsifying 7.0% of the weights, whereas lambda=1e-2 costs 6.2 points. We also document three implementation pitfalls that silently invalidate results while appearing to work.</w:t>
+        <w:t>Decision trees are valued for interpretability, but greedy induction is only locally optimal. RADDT reformulates tree training as an unconstrained differentiable optimization problem via a ReLU + Argmin construction, keeping hard splits while enabling global optimization. We (i) independently reproduce RADDT and compare it with CART and Random Forest on four UCI datasets under 5-fold cross-validation, and (ii) add an L1 penalty on split weights (Sparse-RADDT) and study the effect of tree depth and regularization strength. After correcting the tree-depth configuration, RADDT outperforms CART on all four datasets and matches Random Forest on Wine and BreastCancer. The L1 penalty is highly sensitive to its strength: at lambda=1e-3 it improves Digits accuracy by 1.2 points while sparsifying 7.0% of the weights, whereas lambda=1e-2 costs 6.2 points. We also document four implementation pitfalls that silently invalidate results while appearing to work.</w:t>
       </w:r>
     </w:p>
     <w:p>
@@ -1232,7 +1232,7 @@
           <w:i w:val="0"/>
           <w:sz w:val="21"/>
         </w:rPr>
-        <w:t>这是一个受控对照：只改树深，其余因素全部固定。8 个叶子无法覆盖 10 个类别，准确率被结构性压在 0.68；扩到 16 个叶子后升至 0.88。该约束可以由类别数直接算出，却很容易在复现中被忽略。</w:t>
+        <w:t>这是一个受控对照：只改树深，其余因素全部固定。8 个叶子最多只能输出 8 种预测，覆盖不了 10 个类别；0.681 是实测准确率，不是由叶子数推出的理论上限。扩到 16 个叶子后升至 0.88。该约束可以由类别数直接算出，却很容易在复现中被忽略。</w:t>
       </w:r>
     </w:p>
     <w:p>
@@ -1253,7 +1253,7 @@
       <w:r>
         <w:drawing>
           <wp:inline xmlns:a="http://schemas.openxmlformats.org/drawingml/2006/main" xmlns:pic="http://schemas.openxmlformats.org/drawingml/2006/picture">
-            <wp:extent cx="3960000" cy="2786667"/>
+            <wp:extent cx="3960000" cy="2687143"/>
             <wp:docPr id="3" name="Picture 3"/>
             <wp:cNvGraphicFramePr>
               <a:graphicFrameLocks noChangeAspect="1"/>
@@ -1274,7 +1274,7 @@
                   <pic:spPr>
                     <a:xfrm>
                       <a:off x="0" y="0"/>
-                      <a:ext cx="3960000" cy="2786667"/>
+                      <a:ext cx="3960000" cy="2687143"/>
                     </a:xfrm>
                     <a:prstGeom prst="rect"/>
                   </pic:spPr>
@@ -2219,7 +2219,7 @@
           <w:i w:val="0"/>
           <w:sz w:val="21"/>
         </w:rPr>
-        <w:t>本文复现了基于 ReLU+Argmin 重构的可微分决策树 RADDT，并在其分裂权重上引入 L1 稀疏正则。修正树深设置后，RADDT 在四个数据集上均优于 CART，并在两个数据集上追平随机森林；L1 正则的收益强依赖于强度选择，λ=1e-3 可在保持精度的同时获得约 7% 的权重稀疏。与结果相比，本文更想强调的是复现过程本身：三个不会报错的实现陷阱，足以让一整张实验表格失去意义。</w:t>
+        <w:t>本文复现了基于 ReLU+Argmin 重构的可微分决策树 RADDT，并在其分裂权重上引入 L1 稀疏正则。修正树深设置后，RADDT 在四个数据集上均优于 CART，并在两个数据集上追平随机森林；L1 正则的收益强依赖于强度选择，λ=1e-3 可在保持精度的同时获得约 7% 的权重稀疏。与结果相比，本文更想强调的是复现过程本身：四个不会报错的实现陷阱，足以让一整张实验表格失去意义。</w:t>
       </w:r>
     </w:p>
     <w:p>

</xml_diff>